<commit_message>
docs: client guide covers the conversation, notes from C&K, and phones
- Section 4 is now "Talking to us": a conversation on each option, kept
  and dated, with our replies in the same place, open after approval.
- Notes set to Client appear under "From Christian & Kwan".
- The portal works on a phone, except moving artworks; tablets move them
  by press-and-hold.
- The budget's Export PDF button, on a computer.

Co-Authored-By: Claude Opus 5.5 <noreply@anthropic.com>
Claude-Session: https://claude.ai/code/session_01YXuzKXqVVRXjM9J2hyJKS6
</commit_message>
<xml_diff>
--- a/client-portal-guide.docx
+++ b/client-portal-guide.docx
@@ -69,7 +69,7 @@
           <w:rFonts w:ascii="Georgia" w:cs="Georgia" w:eastAsia="Georgia" w:hAnsi="Georgia"/>
           <w:color w:val="3D3530"/>
         </w:rPr>
-        <w:t xml:space="preserve">Your Elevation Studio portal gives you a private, visual view of the artwork proposal we’ve prepared for your space. You can compare options, reposition artworks, review the budget, share your thoughts, and formally sign off — all in one place, at your own pace.</w:t>
+        <w:t xml:space="preserve">Your Elevation Studio portal gives you a private, visual view of the artwork proposal we’ve prepared for your space. You can compare options, reposition artworks, review the budget, talk to us directly, and formally sign off — all in one place, at your own pace, on a computer, tablet or phone.</w:t>
       </w:r>
     </w:p>
     <w:p>
@@ -115,6 +115,18 @@
     </w:p>
     <w:p>
       <w:pPr>
+        <w:spacing w:after="80" w:before="0"/>
+      </w:pPr>
+      <w:r>
+        <w:rPr>
+          <w:rFonts w:ascii="Georgia" w:cs="Georgia" w:eastAsia="Georgia" w:hAnsi="Georgia"/>
+          <w:color w:val="3D3530"/>
+        </w:rPr>
+        <w:t xml:space="preserve">The portal works on a computer, a tablet or a phone. On a phone you can do everything except move artworks around the wall — for that, and for the best view, open the link on a computer.</w:t>
+      </w:r>
+    </w:p>
+    <w:p>
+      <w:pPr>
         <w:spacing w:after="0" w:before="0"/>
       </w:pPr>
       <w:r>
@@ -360,6 +372,34 @@
           <w:color w:val="3D3530"/>
         </w:rPr>
         <w:t xml:space="preserve">The panel on the right lists each artwork with its size. Before you pick an option, it also shows the artwork prices for that option. The Budget view gives the complete picture, including framing, shipping and any agreed discounts.</w:t>
+      </w:r>
+    </w:p>
+    <w:p>
+      <w:pPr>
+        <w:spacing w:after="0" w:before="100"/>
+      </w:pPr>
+      <w:r>
+        <w:rPr>
+          <w:rFonts w:ascii="Georgia" w:cs="Georgia" w:eastAsia="Georgia" w:hAnsi="Georgia"/>
+          <w:color w:val="3D3530"/>
+        </w:rPr>
+        <w:t xml:space="preserve">Where we have written a note about an option — why we chose these works, or how they suit the room — you will find it in the panel on the right under </w:t>
+      </w:r>
+      <w:r>
+        <w:rPr>
+          <w:rFonts w:ascii="Georgia" w:cs="Georgia" w:eastAsia="Georgia" w:hAnsi="Georgia"/>
+          <w:b/>
+          <w:bCs/>
+          <w:color w:val="3D3530"/>
+        </w:rPr>
+        <w:t xml:space="preserve">From Christian &amp; Kwan</w:t>
+      </w:r>
+      <w:r>
+        <w:rPr>
+          <w:rFonts w:ascii="Georgia" w:cs="Georgia" w:eastAsia="Georgia" w:hAnsi="Georgia"/>
+          <w:color w:val="3D3530"/>
+        </w:rPr>
+        <w:t xml:space="preserve">, just below the option’s name. On a phone, this panel sits beneath the wall rather than beside it.</w:t>
       </w:r>
     </w:p>
     <w:p>
@@ -414,7 +454,7 @@
           <w:rFonts w:ascii="Georgia" w:cs="Georgia" w:eastAsia="Georgia" w:hAnsi="Georgia"/>
           <w:color w:val="3D3530"/>
         </w:rPr>
-        <w:t xml:space="preserve">drag any artwork directly on the wall view to reposition it. Subtle guides will appear to help you align pieces with one another.</w:t>
+        <w:t xml:space="preserve">drag any artwork directly on the wall view to reposition it. Subtle guides will appear to help you align pieces with one another. On a tablet, press and hold an artwork for a moment, then drag.</w:t>
       </w:r>
     </w:p>
     <w:p>
@@ -465,14 +505,26 @@
     </w:p>
     <w:p>
       <w:pPr>
-        <w:spacing w:after="0" w:before="0"/>
-      </w:pPr>
-      <w:r>
-        <w:rPr>
-          <w:rFonts w:ascii="Georgia" w:cs="Georgia" w:eastAsia="Georgia" w:hAnsi="Georgia"/>
-          <w:color w:val="3D3530"/>
-        </w:rPr>
-        <w:t xml:space="preserve">Once you pick an option (see section 5), its artworks are fixed in place, though you can still show or hide them and leave notes.</w:t>
+        <w:spacing w:after="0" w:before="100"/>
+      </w:pPr>
+      <w:r>
+        <w:rPr>
+          <w:rFonts w:ascii="Georgia" w:cs="Georgia" w:eastAsia="Georgia" w:hAnsi="Georgia"/>
+          <w:color w:val="3D3530"/>
+        </w:rPr>
+        <w:t xml:space="preserve">On a phone, artworks stay where they are — at that size, placing work precisely is too fiddly. A short note under the wall suggests opening the link on a computer to rearrange them; you can close it with the ×.</w:t>
+      </w:r>
+    </w:p>
+    <w:p>
+      <w:pPr>
+        <w:spacing w:after="0" w:before="100"/>
+      </w:pPr>
+      <w:r>
+        <w:rPr>
+          <w:rFonts w:ascii="Georgia" w:cs="Georgia" w:eastAsia="Georgia" w:hAnsi="Georgia"/>
+          <w:color w:val="3D3530"/>
+        </w:rPr>
+        <w:t xml:space="preserve">Once you pick an option (see section 5), its artworks are fixed in place, though you can still show or hide them and send us messages.</w:t>
       </w:r>
     </w:p>
     <w:p>
@@ -489,7 +541,79 @@
           <w:sz w:val="24"/>
           <w:szCs w:val="24"/>
         </w:rPr>
-        <w:t xml:space="preserve">4.  Leaving notes for us</w:t>
+        <w:t xml:space="preserve">4.  Talking to us</w:t>
+      </w:r>
+    </w:p>
+    <w:p>
+      <w:pPr>
+        <w:spacing w:after="100" w:before="0"/>
+      </w:pPr>
+      <w:r>
+        <w:rPr>
+          <w:rFonts w:ascii="Georgia" w:cs="Georgia" w:eastAsia="Georgia" w:hAnsi="Georgia"/>
+          <w:color w:val="3D3530"/>
+        </w:rPr>
+        <w:t xml:space="preserve">Each option has its own </w:t>
+      </w:r>
+      <w:r>
+        <w:rPr>
+          <w:rFonts w:ascii="Georgia" w:cs="Georgia" w:eastAsia="Georgia" w:hAnsi="Georgia"/>
+          <w:b/>
+          <w:bCs/>
+          <w:color w:val="3D3530"/>
+        </w:rPr>
+        <w:t xml:space="preserve">Conversation</w:t>
+      </w:r>
+      <w:r>
+        <w:rPr>
+          <w:rFonts w:ascii="Georgia" w:cs="Georgia" w:eastAsia="Georgia" w:hAnsi="Georgia"/>
+          <w:color w:val="3D3530"/>
+        </w:rPr>
+        <w:t xml:space="preserve">, in the panel on the right. It is the ideal place to ask a question or share a thought — for example, a preference for a different hanging height, or a question about a particular work.</w:t>
+      </w:r>
+    </w:p>
+    <w:p>
+      <w:pPr>
+        <w:spacing w:after="100" w:before="0"/>
+      </w:pPr>
+      <w:r>
+        <w:rPr>
+          <w:rFonts w:ascii="Georgia" w:cs="Georgia" w:eastAsia="Georgia" w:hAnsi="Georgia"/>
+          <w:color w:val="3D3530"/>
+        </w:rPr>
+        <w:t xml:space="preserve">Type your message and click </w:t>
+      </w:r>
+      <w:r>
+        <w:rPr>
+          <w:rFonts w:ascii="Georgia" w:cs="Georgia" w:eastAsia="Georgia" w:hAnsi="Georgia"/>
+          <w:b/>
+          <w:bCs/>
+          <w:color w:val="3D3530"/>
+        </w:rPr>
+        <w:t xml:space="preserve">Send</w:t>
+      </w:r>
+      <w:r>
+        <w:rPr>
+          <w:rFonts w:ascii="Georgia" w:cs="Georgia" w:eastAsia="Georgia" w:hAnsi="Georgia"/>
+          <w:color w:val="3D3530"/>
+        </w:rPr>
+        <w:t xml:space="preserve">. It is kept, with the date, so the whole conversation stays with the layout it refers to. We are notified by email, and our replies appear in the same place, marked </w:t>
+      </w:r>
+      <w:r>
+        <w:rPr>
+          <w:rFonts w:ascii="Georgia" w:cs="Georgia" w:eastAsia="Georgia" w:hAnsi="Georgia"/>
+          <w:b/>
+          <w:bCs/>
+          <w:color w:val="3D3530"/>
+        </w:rPr>
+        <w:t xml:space="preserve">Christian &amp; Kwan</w:t>
+      </w:r>
+      <w:r>
+        <w:rPr>
+          <w:rFonts w:ascii="Georgia" w:cs="Georgia" w:eastAsia="Georgia" w:hAnsi="Georgia"/>
+          <w:color w:val="3D3530"/>
+        </w:rPr>
+        <w:t xml:space="preserve">.</w:t>
       </w:r>
     </w:p>
     <w:p>
@@ -501,23 +625,7 @@
           <w:rFonts w:ascii="Georgia" w:cs="Georgia" w:eastAsia="Georgia" w:hAnsi="Georgia"/>
           <w:color w:val="3D3530"/>
         </w:rPr>
-        <w:t xml:space="preserve">The </w:t>
-      </w:r>
-      <w:r>
-        <w:rPr>
-          <w:rFonts w:ascii="Georgia" w:cs="Georgia" w:eastAsia="Georgia" w:hAnsi="Georgia"/>
-          <w:b/>
-          <w:bCs/>
-          <w:color w:val="3D3530"/>
-        </w:rPr>
-        <w:t xml:space="preserve">Notes for Christian &amp; Kwan</w:t>
-      </w:r>
-      <w:r>
-        <w:rPr>
-          <w:rFonts w:ascii="Georgia" w:cs="Georgia" w:eastAsia="Georgia" w:hAnsi="Georgia"/>
-          <w:color w:val="3D3530"/>
-        </w:rPr>
-        <w:t xml:space="preserve"> box in the right-hand panel is the ideal place to share any thoughts, questions, or requests — for example, a preference for a different hanging height, or a question about a particular work. Each option has its own notes box, so your comments stay with the layout they refer to. Notes are saved automatically as you type.</w:t>
+        <w:t xml:space="preserve">The conversation stays open after you approve a wall, so questions about delivery or hanging are always welcome there too.</w:t>
       </w:r>
     </w:p>
     <w:p>
@@ -694,7 +802,7 @@
           <w:rFonts w:ascii="Georgia" w:cs="Georgia" w:eastAsia="Georgia" w:hAnsi="Georgia"/>
           <w:color w:val="3D3530"/>
         </w:rPr>
-        <w:t xml:space="preserve"> submits the elevation to us for project sign-off. The wall is then locked, and the panel shows when it was approved.</w:t>
+        <w:t xml:space="preserve"> submits the elevation to us for project sign-off. The wall is then locked, and the panel shows when it was approved. You can still message us about it.</w:t>
       </w:r>
     </w:p>
     <w:p>
@@ -932,6 +1040,32 @@
           <w:color w:val="3D3530"/>
         </w:rPr>
         <w:t xml:space="preserve">where they apply, these are listed separately.</w:t>
+      </w:r>
+    </w:p>
+    <w:p>
+      <w:pPr>
+        <w:pStyle w:val="ListParagraph"/>
+        <w:numPr>
+          <w:ilvl w:val="0"/>
+          <w:numId w:val="2"/>
+        </w:numPr>
+        <w:spacing w:after="0" w:before="60"/>
+      </w:pPr>
+      <w:r>
+        <w:rPr>
+          <w:rFonts w:ascii="Georgia" w:cs="Georgia" w:eastAsia="Georgia" w:hAnsi="Georgia"/>
+          <w:b/>
+          <w:bCs/>
+          <w:color w:val="3D3530"/>
+        </w:rPr>
+        <w:t xml:space="preserve">Export PDF: </w:t>
+      </w:r>
+      <w:r>
+        <w:rPr>
+          <w:rFonts w:ascii="Georgia" w:cs="Georgia" w:eastAsia="Georgia" w:hAnsi="Georgia"/>
+          <w:color w:val="3D3530"/>
+        </w:rPr>
+        <w:t xml:space="preserve">on a computer, this button at the top of the Budget view opens your browser’s print window, where you can save the budget as a PDF.</w:t>
       </w:r>
     </w:p>
     <w:p>

</xml_diff>